<commit_message>
Update report docx with GitHub link, remove redundant report.md
</commit_message>
<xml_diff>
--- a/Assignment3_MayurPatel_Report.docx
+++ b/Assignment3_MayurPatel_Report.docx
@@ -4977,11 +4977,95 @@
         <w:rPr>
           <w:rFonts w:ascii="Times New Roman" w:hAnsi="Times New Roman"/>
           <w:b w:val="0"/>
+          <w:bCs w:val="0"/>
           <w:i w:val="0"/>
+          <w:iCs w:val="0"/>
           <w:sz w:val="24"/>
+          <w:szCs w:val="24"/>
         </w:rPr>
         <w:t>Together, these two algorithms demonstrate an important design principle: introducing controlled randomness (random pivot selection, random hash function parameters) can eliminate worst-case behavior that would otherwise occur on structured inputs, without adding any meaningful overhead in the average case.</w:t>
       </w:r>
+    </w:p>
+    <w:p>
+      <w:pPr>
+        <w:spacing w:before="0" w:after="160"/>
+        <w:jc w:val="left"/>
+        <w:rPr>
+          <w:rFonts w:ascii="Times New Roman" w:hAnsi="Times New Roman"/>
+          <w:b w:val="0"/>
+          <w:bCs w:val="0"/>
+          <w:i w:val="0"/>
+          <w:iCs w:val="0"/>
+          <w:sz w:val="24"/>
+          <w:szCs w:val="24"/>
+        </w:rPr>
+      </w:pPr>
+    </w:p>
+    <w:p>
+      <w:pPr>
+        <w:jc w:val="left"/>
+        <w:rPr>
+          <w:rFonts w:ascii="Menlo" w:hAnsi="Menlo" w:eastAsia="Menlo" w:cs="Menlo"/>
+          <w:i w:val="0"/>
+          <w:iCs w:val="0"/>
+          <w:noProof w:val="0"/>
+          <w:color w:val="000000" w:themeColor="text1" w:themeTint="FF" w:themeShade="FF"/>
+          <w:sz w:val="16"/>
+          <w:szCs w:val="16"/>
+          <w:lang w:val="en-US"/>
+        </w:rPr>
+      </w:pPr>
+      <w:r>
+        <w:rPr>
+          <w:rFonts w:ascii="Times New Roman" w:hAnsi="Times New Roman"/>
+          <w:b w:val="0"/>
+          <w:bCs w:val="0"/>
+          <w:i w:val="0"/>
+          <w:iCs w:val="0"/>
+          <w:sz w:val="24"/>
+          <w:szCs w:val="24"/>
+        </w:rPr>
+        <w:t>Github</w:t>
+      </w:r>
+      <w:r>
+        <w:rPr>
+          <w:rFonts w:ascii="Times New Roman" w:hAnsi="Times New Roman"/>
+          <w:b w:val="0"/>
+          <w:bCs w:val="0"/>
+          <w:i w:val="0"/>
+          <w:iCs w:val="0"/>
+          <w:sz w:val="24"/>
+          <w:szCs w:val="24"/>
+        </w:rPr>
+        <w:t xml:space="preserve"> Link: </w:t>
+      </w:r>
+      <w:hyperlink r:id="R80d87e08d7144458">
+        <w:r>
+          <w:rPr>
+            <w:rStyle w:val="Hyperlink"/>
+            <w:i w:val="0"/>
+            <w:iCs w:val="0"/>
+            <w:noProof w:val="0"/>
+            <w:lang w:val="en-US"/>
+          </w:rPr>
+          <w:t>https://github.com/Champagnepappi18/mscs532-assignment3</w:t>
+        </w:r>
+      </w:hyperlink>
+    </w:p>
+    <w:p>
+      <w:pPr>
+        <w:spacing w:before="0" w:after="160"/>
+        <w:jc w:val="left"/>
+        <w:rPr>
+          <w:rFonts w:ascii="Times New Roman" w:hAnsi="Times New Roman"/>
+          <w:b w:val="0"/>
+          <w:bCs w:val="0"/>
+          <w:i w:val="0"/>
+          <w:iCs w:val="0"/>
+          <w:sz w:val="24"/>
+          <w:szCs w:val="24"/>
+        </w:rPr>
+      </w:pPr>
     </w:p>
     <w:p xmlns:wp14="http://schemas.microsoft.com/office/word/2010/wordml" wp14:textId="77777777">
       <w:r>
@@ -17140,6 +17224,17 @@
         <w:shd w:val="clear" w:color="auto" w:fill="FBCAA2" w:themeFill="accent6" w:themeFillTint="7F"/>
       </w:tcPr>
     </w:tblStylePr>
+  </w:style>
+  <w:style w:type="character" w:styleId="Hyperlink">
+    <w:uiPriority w:val="99"/>
+    <w:name w:val="Hyperlink"/>
+    <w:basedOn w:val="DefaultParagraphFont"/>
+    <w:unhideWhenUsed/>
+    <w:rsid w:val="7EECA028"/>
+    <w:rPr>
+      <w:color w:val="0000FF"/>
+      <w:u w:val="single"/>
+    </w:rPr>
   </w:style>
 </w:styles>
 </file>

</xml_diff>